<commit_message>
Fixed inconsistencies in a few decks
Fix stale figures in three decks: Oct14 S2's Rule 5 slide now
matches the data (4,080 / 3,365 / 715), and Oct13 S1 and S3
describe Day 1 S2 as -2.53 against the 2.0 rule with no comparison
group. Oct13 S1's callbacks to "Session 1, Session 2" now point to
Day 1. Re-render Oct13 S1, Oct13 S3 and Oct14 S2.
</commit_message>
<xml_diff>
--- a/Module_2_Oct_2026_v2/Oct15_session1_report.docx
+++ b/Module_2_Oct_2026_v2/Oct15_session1_report.docx
@@ -322,13 +322,13 @@
         <w:t xml:space="preserve"> </w:t>
       </w:r>
       <w:r>
-        <w:t xml:space="preserve">Businesses scoring at or above 58 on that index were eligible for the subsidy;</w:t>
-      </w:r>
-      <w:r>
-        <w:t xml:space="preserve"> </w:t>
-      </w:r>
-      <w:r>
-        <w:t xml:space="preserve">businesses scoring below it were not. In treatment neighbourhoods, all eligible</w:t>
+        <w:t xml:space="preserve">Businesses scoring at or below 58 on that index were eligible for the subsidy;</w:t>
+      </w:r>
+      <w:r>
+        <w:t xml:space="preserve"> </w:t>
+      </w:r>
+      <w:r>
+        <w:t xml:space="preserve">businesses scoring above it were not. In treatment neighbourhoods, all eligible</w:t>
       </w:r>
       <w:r>
         <w:t xml:space="preserve"> </w:t>
@@ -1206,7 +1206,7 @@
         <w:t xml:space="preserve"> </w:t>
       </w:r>
       <w:r>
-        <w:t xml:space="preserve">regression discontinuity results suggest that businesses just below the threshold</w:t>
+        <w:t xml:space="preserve">regression discontinuity results suggest that businesses just above the threshold</w:t>
       </w:r>
       <w:r>
         <w:t xml:space="preserve"> </w:t>

</xml_diff>